<commit_message>
Remove bibliography and citation markers from English paper
</commit_message>
<xml_diff>
--- a/reports/ME5704_English_Colour.docx
+++ b/reports/ME5704_English_Colour.docx
@@ -1376,7 +1376,7 @@
           <w:rFonts w:ascii="Times New Roman" w:hAnsi="Times New Roman" w:eastAsia="宋体"/>
           <w:color w:val="000000"/>
         </w:rPr>
-        <w:t xml:space="preserve">Define u=(x−1.28)/0.8772684880 and v=(y−1.16)/0.8089499366, with basis [1,u,v,u²,uv,v²]. Five observation equations contain six unknown coefficients. numpy.linalg.lstsq selects the exact solution with the smallest Euclidean norm of the standardised coefficients, following its minimum-norm convention [1]. In the original coordinates, the fitted model is given by Equation (4).</w:t>
+        <w:t xml:space="preserve">Define u=(x−1.28)/0.8772684880 and v=(y−1.16)/0.8089499366, with basis [1,u,v,u²,uv,v²]. Five observation equations contain six unknown coefficients. numpy.linalg.lstsq selects the exact solution with the smallest Euclidean norm of the standardised coefficients, following its minimum-norm convention. In the original coordinates, the fitted model is given by Equation (4).</w:t>
       </w:r>
     </w:p>
     <w:p>
@@ -1595,7 +1595,7 @@
           <w:rFonts w:ascii="Times New Roman" w:hAnsi="Times New Roman" w:eastAsia="宋体"/>
           <w:color w:val="000000"/>
         </w:rPr>
-        <w:t xml:space="preserve">TPS combines an affine term with radial basis functions. Equation (5) uses the thin-plate kernel and affine augmentation described in the RBF interpolation documentation [2].</w:t>
+        <w:t xml:space="preserve">TPS combines an affine term with radial basis functions. Equation (5) uses the thin-plate kernel and affine augmentation described in the RBF interpolation documentation.</w:t>
       </w:r>
     </w:p>
     <w:p>
@@ -2218,7 +2218,7 @@
           <w:rFonts w:ascii="Times New Roman" w:hAnsi="Times New Roman" w:eastAsia="宋体"/>
           <w:color w:val="000000"/>
         </w:rPr>
-        <w:t xml:space="preserve">The radial distance is r=√[(x−x₀)²+(y−y₀)²]. The SciPy comparison uses bounded nonlinear least squares through least_squares [3].</w:t>
+        <w:t xml:space="preserve">The radial distance is r=√[(x−x₀)²+(y−y₀)²]. The SciPy comparison uses bounded nonlinear least squares through least_squares.</w:t>
       </w:r>
     </w:p>
     <w:p>
@@ -11714,7 +11714,7 @@
           <w:rFonts w:ascii="Times New Roman" w:hAnsi="Times New Roman" w:eastAsia="宋体"/>
           <w:color w:val="000000"/>
         </w:rPr>
-        <w:t xml:space="preserve">With S1 or S4 withheld, the fit reaches the artificial upper bound A=2000. Increasing that bound by a factor of 100 changes S1 prediction from 106.68 to 113.68 and S4 prediction from 513.97 to 843.55. These results show bound sensitivity, not a proof that no finite solution exists. S3 and S5 folds reach R=0, a Gaussian peak limit; no bound hit is detected for S2. Largest-width selection in each fold uses equality-constrained SLSQP [4].</w:t>
+        <w:t xml:space="preserve">With S1 or S4 withheld, the fit reaches the artificial upper bound A=2000. Increasing that bound by a factor of 100 changes S1 prediction from 106.68 to 113.68 and S4 prediction from 513.97 to 843.55. These results show bound sensitivity, not a proof that no finite solution exists. S3 and S5 folds reach R=0, a Gaussian peak limit; no bound hit is detected for S2. Largest-width selection in each fold uses equality-constrained SLSQP.</w:t>
       </w:r>
     </w:p>
     <w:p>
@@ -11876,99 +11876,6 @@
           <w:rFonts w:ascii="Times New Roman" w:hAnsi="Times New Roman" w:eastAsia="黑体"/>
           <w:color w:val="000000"/>
         </w:rPr>
-        <w:t xml:space="preserve">References</w:t>
-      </w:r>
-    </w:p>
-    <w:p>
-      <w:pPr>
-        <w:widowControl/>
-        <w:spacing w:line="360" w:lineRule="auto"/>
-        <w:ind w:hanging="360" w:left="360"/>
-        <w:jc w:val="left"/>
-      </w:pPr>
-      <w:r>
-        <w:rPr>
-          <w:rFonts w:ascii="Times New Roman" w:hAnsi="Times New Roman" w:eastAsia="宋体"/>
-          <w:color w:val="000000"/>
-          <w:sz w:val="21"/>
-        </w:rPr>
-        <w:t>[1] NumPy Developers. numpy.linalg.lstsq[EB/OL]. NumPy v2.3 Manual [2026-09-30]. https://numpy.org/doc/2.3/reference/generated/numpy.linalg.lstsq.html.</w:t>
-      </w:r>
-    </w:p>
-    <w:p>
-      <w:pPr>
-        <w:widowControl/>
-        <w:spacing w:line="360" w:lineRule="auto"/>
-        <w:ind w:hanging="360" w:left="360"/>
-        <w:jc w:val="left"/>
-      </w:pPr>
-      <w:r>
-        <w:rPr>
-          <w:rFonts w:ascii="Times New Roman" w:hAnsi="Times New Roman" w:eastAsia="宋体"/>
-          <w:color w:val="000000"/>
-          <w:sz w:val="21"/>
-        </w:rPr>
-        <w:t>[2] SciPy Developers. RBFInterpolator[EB/OL]. SciPy v1.16.2 Manual [2026-09-30]. https://docs.scipy.org/doc/scipy-1.16.2/reference/generated/scipy.interpolate.RBFInterpolator.html.</w:t>
-      </w:r>
-    </w:p>
-    <w:p>
-      <w:pPr>
-        <w:widowControl/>
-        <w:spacing w:line="360" w:lineRule="auto"/>
-        <w:ind w:hanging="360" w:left="360"/>
-        <w:jc w:val="left"/>
-      </w:pPr>
-      <w:r>
-        <w:rPr>
-          <w:rFonts w:ascii="Times New Roman" w:hAnsi="Times New Roman" w:eastAsia="宋体"/>
-          <w:color w:val="000000"/>
-          <w:sz w:val="21"/>
-        </w:rPr>
-        <w:t>[3] SciPy Developers. least_squares[EB/OL]. SciPy v1.16.2 Manual [2026-09-30]. https://docs.scipy.org/doc/scipy-1.16.2/reference/generated/scipy.optimize.least_squares.html.</w:t>
-      </w:r>
-    </w:p>
-    <w:p>
-      <w:pPr>
-        <w:widowControl/>
-        <w:spacing w:line="360" w:lineRule="auto"/>
-        <w:ind w:hanging="360" w:left="360"/>
-        <w:jc w:val="left"/>
-      </w:pPr>
-      <w:r>
-        <w:rPr>
-          <w:rFonts w:ascii="Times New Roman" w:hAnsi="Times New Roman" w:eastAsia="宋体"/>
-          <w:color w:val="000000"/>
-          <w:sz w:val="21"/>
-        </w:rPr>
-        <w:t>[4] SciPy Developers. minimize(method=SLSQP)[EB/OL]. SciPy v1.16.2 Manual [2026-09-30]. https://docs.scipy.org/doc/scipy-1.16.2/reference/optimize.minimize-slsqp.html.</w:t>
-      </w:r>
-    </w:p>
-    <w:p>
-      <w:pPr>
-        <w:widowControl/>
-        <w:spacing w:line="360" w:lineRule="auto"/>
-        <w:ind w:hanging="360" w:left="360"/>
-        <w:jc w:val="left"/>
-      </w:pPr>
-      <w:r>
-        <w:rPr>
-          <w:rFonts w:ascii="Times New Roman" w:hAnsi="Times New Roman" w:eastAsia="宋体"/>
-          <w:color w:val="000000"/>
-          <w:sz w:val="21"/>
-        </w:rPr>
-        <w:t xml:space="preserve">[5] ME5704 Project Group. ME5704project source code and numerical results [software]. Baseline commits 3214007 and 5ecc1de; integrated validation on branch report/english-validation. Accessed 2026-09-30. https://github.com/lincongxiii/ME5704project.</w:t>
-      </w:r>
-    </w:p>
-    <w:p>
-      <w:pPr>
-        <w:pStyle w:val="Heading1"/>
-        <w:widowControl/>
-      </w:pPr>
-      <w:r>
-        <w:rPr>
-          <w:rFonts w:ascii="Times New Roman" w:hAnsi="Times New Roman" w:eastAsia="黑体"/>
-          <w:color w:val="000000"/>
-        </w:rPr>
         <w:t xml:space="preserve">Appendix A Reproducibility and Data Sources</w:t>
       </w:r>
     </w:p>
@@ -11996,7 +11903,7 @@
           <w:rFonts w:ascii="Times New Roman" w:hAnsi="Times New Roman" w:eastAsia="宋体"/>
           <w:color w:val="000000"/>
         </w:rPr>
-        <w:t xml:space="preserve">Numerical calculations use Python 3.12, NumPy 2.3.5, SciPy 1.16.3, Matplotlib 3.10.7 and pytest 8.3.5. References [2–4] describe SciPy 1.16.2; the executed version is 1.16.3. The baseline quadratic Monte Carlo fix is commit 3214007 and the contact-model fix is 5ecc1de [5]. validation/evidence/results.json records exact source-file hashes, versions and the validation timestamp for this integrated run.</w:t>
+        <w:t xml:space="preserve">Numerical calculations use Python 3.12, NumPy 2.3.5, SciPy 1.16.3, Matplotlib 3.10.7 and pytest 8.3.5. The baseline quadratic Monte Carlo fix is commit 3214007 and the contact-model fix is 5ecc1de. validation/evidence/results.json records exact source-file hashes, versions and the validation timestamp for this integrated run.</w:t>
       </w:r>
     </w:p>
     <w:p>

</xml_diff>